<commit_message>
appoint a rep contact center guide 2.2
</commit_message>
<xml_diff>
--- a/products/accredited-representation-management/product-documentation/appoint-a-representative/contact-center/product-guide-appoint-a-representative-2.2.docx
+++ b/products/accredited-representation-management/product-documentation/appoint-a-representative/contact-center/product-guide-appoint-a-representative-2.2.docx
@@ -190,6 +190,15 @@
       </w:pPr>
       <w:r>
         <w:rPr>
+          <w:color w:val="5b616b"/>
+          <w:sz w:val="32"/>
+          <w:szCs w:val="32"/>
+          <w:rtl w:val="0"/>
+        </w:rPr>
+        <w:t xml:space="preserve">April 15</w:t>
+      </w:r>
+      <w:r>
+        <w:rPr>
           <w:rFonts w:ascii="Calibri" w:cs="Calibri" w:eastAsia="Calibri" w:hAnsi="Calibri"/>
           <w:b w:val="0"/>
           <w:bCs w:val="0"/>
@@ -205,7 +214,35 @@
           <w:vertAlign w:val="baseline"/>
           <w:rtl w:val="0"/>
         </w:rPr>
-        <w:t xml:space="preserve">June 25, 2025 | Appoint a Representative</w:t>
+        <w:t xml:space="preserve">, 202</w:t>
+      </w:r>
+      <w:r>
+        <w:rPr>
+          <w:color w:val="5b616b"/>
+          <w:sz w:val="32"/>
+          <w:szCs w:val="32"/>
+          <w:rtl w:val="0"/>
+        </w:rPr>
+        <w:t xml:space="preserve">6</w:t>
+      </w:r>
+      <w:r>
+        <w:rPr>
+          <w:rFonts w:ascii="Calibri" w:cs="Calibri" w:eastAsia="Calibri" w:hAnsi="Calibri"/>
+          <w:b w:val="0"/>
+          <w:bCs w:val="0"/>
+          <w:i w:val="0"/>
+          <w:iCs w:val="0"/>
+          <w:smallCaps w:val="0"/>
+          <w:strike w:val="0"/>
+          <w:color w:val="5b616b"/>
+          <w:sz w:val="32"/>
+          <w:szCs w:val="32"/>
+          <w:u w:val="none"/>
+          <w:shd w:fill="auto" w:val="clear"/>
+          <w:vertAlign w:val="baseline"/>
+          <w:rtl w:val="0"/>
+        </w:rPr>
+        <w:t xml:space="preserve"> | Appoint a Representative</w:t>
       </w:r>
     </w:p>
     <w:p>
@@ -258,7 +295,34 @@
           <w:vertAlign w:val="baseline"/>
           <w:rtl w:val="0"/>
         </w:rPr>
-        <w:t xml:space="preserve">Version 2.1</w:t>
+        <w:t xml:space="preserve">Version 2.</w:t>
+      </w:r>
+      <w:r>
+        <w:rPr>
+          <w:color w:val="5b616b"/>
+          <w:sz w:val="32"/>
+          <w:szCs w:val="32"/>
+          <w:rtl w:val="0"/>
+        </w:rPr>
+        <w:t xml:space="preserve">2</w:t>
+      </w:r>
+      <w:r>
+        <w:rPr>
+          <w:rFonts w:ascii="Calibri" w:cs="Calibri" w:eastAsia="Calibri" w:hAnsi="Calibri"/>
+          <w:b w:val="0"/>
+          <w:bCs w:val="0"/>
+          <w:i w:val="0"/>
+          <w:iCs w:val="0"/>
+          <w:smallCaps w:val="0"/>
+          <w:strike w:val="0"/>
+          <w:color w:val="5b616b"/>
+          <w:sz w:val="32"/>
+          <w:szCs w:val="32"/>
+          <w:u w:val="none"/>
+          <w:shd w:fill="auto" w:val="clear"/>
+          <w:vertAlign w:val="baseline"/>
+          <w:rtl w:val="0"/>
+        </w:rPr>
         <w:br w:type="textWrapping"/>
       </w:r>
       <w:r>
@@ -1593,7 +1657,7 @@
     </w:p>
     <w:sdt>
       <w:sdtPr>
-        <w:id w:val="1824011927"/>
+        <w:id w:val="-743366915"/>
         <w:docPartObj>
           <w:docPartGallery w:val="Table of Contents"/>
           <w:docPartUnique w:val="1"/>
@@ -4818,12 +4882,12 @@
           <wp:inline distB="0" distT="0" distL="0" distR="0">
             <wp:extent cx="2993591" cy="7106498"/>
             <wp:effectExtent b="0" l="0" r="0" t="0"/>
-            <wp:docPr id="2095254938" name="image8.png"/>
+            <wp:docPr id="2095254938" name="image25.png"/>
             <a:graphic>
               <a:graphicData uri="http://schemas.openxmlformats.org/drawingml/2006/picture">
                 <pic:pic>
                   <pic:nvPicPr>
-                    <pic:cNvPr id="0" name="image8.png"/>
+                    <pic:cNvPr id="0" name="image25.png"/>
                     <pic:cNvPicPr preferRelativeResize="0"/>
                   </pic:nvPicPr>
                   <pic:blipFill>
@@ -4999,12 +5063,12 @@
           <wp:inline distB="0" distT="0" distL="0" distR="0">
             <wp:extent cx="3532820" cy="2303882"/>
             <wp:effectExtent b="0" l="0" r="0" t="0"/>
-            <wp:docPr id="2095254941" name="image3.png"/>
+            <wp:docPr id="2095254941" name="image6.png"/>
             <a:graphic>
               <a:graphicData uri="http://schemas.openxmlformats.org/drawingml/2006/picture">
                 <pic:pic>
                   <pic:nvPicPr>
-                    <pic:cNvPr id="0" name="image3.png"/>
+                    <pic:cNvPr id="0" name="image6.png"/>
                     <pic:cNvPicPr preferRelativeResize="0"/>
                   </pic:nvPicPr>
                   <pic:blipFill>
@@ -5198,12 +5262,12 @@
           <wp:inline distB="0" distT="0" distL="0" distR="0">
             <wp:extent cx="3518328" cy="3403680"/>
             <wp:effectExtent b="0" l="0" r="0" t="0"/>
-            <wp:docPr id="2095254940" name="image16.png"/>
+            <wp:docPr id="2095254940" name="image8.png"/>
             <a:graphic>
               <a:graphicData uri="http://schemas.openxmlformats.org/drawingml/2006/picture">
                 <pic:pic>
                   <pic:nvPicPr>
-                    <pic:cNvPr id="0" name="image16.png"/>
+                    <pic:cNvPr id="0" name="image8.png"/>
                     <pic:cNvPicPr preferRelativeResize="0"/>
                   </pic:nvPicPr>
                   <pic:blipFill>
@@ -5366,12 +5430,12 @@
           <wp:inline distB="0" distT="0" distL="0" distR="0">
             <wp:extent cx="2902810" cy="3573620"/>
             <wp:effectExtent b="0" l="0" r="0" t="0"/>
-            <wp:docPr id="2095254943" name="image11.png"/>
+            <wp:docPr id="2095254943" name="image12.png"/>
             <a:graphic>
               <a:graphicData uri="http://schemas.openxmlformats.org/drawingml/2006/picture">
                 <pic:pic>
                   <pic:nvPicPr>
-                    <pic:cNvPr id="0" name="image11.png"/>
+                    <pic:cNvPr id="0" name="image12.png"/>
                     <pic:cNvPicPr preferRelativeResize="0"/>
                   </pic:nvPicPr>
                   <pic:blipFill>
@@ -5567,12 +5631,12 @@
           <wp:inline distB="0" distT="0" distL="0" distR="0">
             <wp:extent cx="2805230" cy="2569392"/>
             <wp:effectExtent b="0" l="0" r="0" t="0"/>
-            <wp:docPr id="2095254942" name="image28.png"/>
+            <wp:docPr id="2095254942" name="image16.png"/>
             <a:graphic>
               <a:graphicData uri="http://schemas.openxmlformats.org/drawingml/2006/picture">
                 <pic:pic>
                   <pic:nvPicPr>
-                    <pic:cNvPr id="0" name="image28.png"/>
+                    <pic:cNvPr id="0" name="image16.png"/>
                     <pic:cNvPicPr preferRelativeResize="0"/>
                   </pic:nvPicPr>
                   <pic:blipFill>
@@ -5720,12 +5784,12 @@
           <wp:inline distB="0" distT="0" distL="0" distR="0">
             <wp:extent cx="2817757" cy="2968881"/>
             <wp:effectExtent b="0" l="0" r="0" t="0"/>
-            <wp:docPr id="2095254945" name="image13.png"/>
+            <wp:docPr id="2095254945" name="image15.png"/>
             <a:graphic>
               <a:graphicData uri="http://schemas.openxmlformats.org/drawingml/2006/picture">
                 <pic:pic>
                   <pic:nvPicPr>
-                    <pic:cNvPr id="0" name="image13.png"/>
+                    <pic:cNvPr id="0" name="image15.png"/>
                     <pic:cNvPicPr preferRelativeResize="0"/>
                   </pic:nvPicPr>
                   <pic:blipFill>
@@ -6207,12 +6271,12 @@
           <wp:inline distB="0" distT="0" distL="0" distR="0">
             <wp:extent cx="2719936" cy="2479907"/>
             <wp:effectExtent b="0" l="0" r="0" t="0"/>
-            <wp:docPr id="2095254948" name="image19.png"/>
+            <wp:docPr id="2095254948" name="image27.png"/>
             <a:graphic>
               <a:graphicData uri="http://schemas.openxmlformats.org/drawingml/2006/picture">
                 <pic:pic>
                   <pic:nvPicPr>
-                    <pic:cNvPr id="0" name="image19.png"/>
+                    <pic:cNvPr id="0" name="image27.png"/>
                     <pic:cNvPicPr preferRelativeResize="0"/>
                   </pic:nvPicPr>
                   <pic:blipFill>
@@ -6360,12 +6424,12 @@
           <wp:inline distB="0" distT="0" distL="0" distR="0">
             <wp:extent cx="2863376" cy="3615927"/>
             <wp:effectExtent b="0" l="0" r="0" t="0"/>
-            <wp:docPr id="2095254946" name="image25.png"/>
+            <wp:docPr id="2095254946" name="image14.png"/>
             <a:graphic>
               <a:graphicData uri="http://schemas.openxmlformats.org/drawingml/2006/picture">
                 <pic:pic>
                   <pic:nvPicPr>
-                    <pic:cNvPr id="0" name="image25.png"/>
+                    <pic:cNvPr id="0" name="image14.png"/>
                     <pic:cNvPicPr preferRelativeResize="0"/>
                   </pic:nvPicPr>
                   <pic:blipFill>
@@ -6509,12 +6573,12 @@
           <wp:inline distB="0" distT="0" distL="0" distR="0">
             <wp:extent cx="3128816" cy="4581341"/>
             <wp:effectExtent b="0" l="0" r="0" t="0"/>
-            <wp:docPr id="2095254947" name="image17.png"/>
+            <wp:docPr id="2095254947" name="image23.png"/>
             <a:graphic>
               <a:graphicData uri="http://schemas.openxmlformats.org/drawingml/2006/picture">
                 <pic:pic>
                   <pic:nvPicPr>
-                    <pic:cNvPr id="0" name="image17.png"/>
+                    <pic:cNvPr id="0" name="image23.png"/>
                     <pic:cNvPicPr preferRelativeResize="0"/>
                   </pic:nvPicPr>
                   <pic:blipFill>
@@ -6660,12 +6724,12 @@
           <wp:inline distB="0" distT="0" distL="0" distR="0">
             <wp:extent cx="3124633" cy="2677637"/>
             <wp:effectExtent b="0" l="0" r="0" t="0"/>
-            <wp:docPr id="2095254949" name="image24.png"/>
+            <wp:docPr id="2095254949" name="image26.png"/>
             <a:graphic>
               <a:graphicData uri="http://schemas.openxmlformats.org/drawingml/2006/picture">
                 <pic:pic>
                   <pic:nvPicPr>
-                    <pic:cNvPr id="0" name="image24.png"/>
+                    <pic:cNvPr id="0" name="image26.png"/>
                     <pic:cNvPicPr preferRelativeResize="0"/>
                   </pic:nvPicPr>
                   <pic:blipFill>
@@ -6977,12 +7041,12 @@
           <wp:inline distB="0" distT="0" distL="0" distR="0">
             <wp:extent cx="4058411" cy="5753510"/>
             <wp:effectExtent b="0" l="0" r="0" t="0"/>
-            <wp:docPr id="2095254950" name="image23.png"/>
+            <wp:docPr id="2095254950" name="image20.png"/>
             <a:graphic>
               <a:graphicData uri="http://schemas.openxmlformats.org/drawingml/2006/picture">
                 <pic:pic>
                   <pic:nvPicPr>
-                    <pic:cNvPr id="0" name="image23.png"/>
+                    <pic:cNvPr id="0" name="image20.png"/>
                     <pic:cNvPicPr preferRelativeResize="0"/>
                   </pic:nvPicPr>
                   <pic:blipFill>
@@ -7269,12 +7333,12 @@
           <wp:inline distB="0" distT="0" distL="0" distR="0">
             <wp:extent cx="2988043" cy="2855731"/>
             <wp:effectExtent b="0" l="0" r="0" t="0"/>
-            <wp:docPr id="2095254952" name="image21.png"/>
+            <wp:docPr id="2095254952" name="image17.png"/>
             <a:graphic>
               <a:graphicData uri="http://schemas.openxmlformats.org/drawingml/2006/picture">
                 <pic:pic>
                   <pic:nvPicPr>
-                    <pic:cNvPr id="0" name="image21.png"/>
+                    <pic:cNvPr id="0" name="image17.png"/>
                     <pic:cNvPicPr preferRelativeResize="0"/>
                   </pic:nvPicPr>
                   <pic:blipFill>
@@ -7410,12 +7474,12 @@
           <wp:inline distB="0" distT="0" distL="0" distR="0">
             <wp:extent cx="2923599" cy="3532535"/>
             <wp:effectExtent b="0" l="0" r="0" t="0"/>
-            <wp:docPr id="2095254953" name="image20.png"/>
+            <wp:docPr id="2095254953" name="image24.png"/>
             <a:graphic>
               <a:graphicData uri="http://schemas.openxmlformats.org/drawingml/2006/picture">
                 <pic:pic>
                   <pic:nvPicPr>
-                    <pic:cNvPr id="0" name="image20.png"/>
+                    <pic:cNvPr id="0" name="image24.png"/>
                     <pic:cNvPicPr preferRelativeResize="0"/>
                   </pic:nvPicPr>
                   <pic:blipFill>
@@ -7572,12 +7636,12 @@
           <wp:inline distB="0" distT="0" distL="0" distR="0">
             <wp:extent cx="2933164" cy="3580188"/>
             <wp:effectExtent b="0" l="0" r="0" t="0"/>
-            <wp:docPr id="2095254954" name="image22.png"/>
+            <wp:docPr id="2095254954" name="image19.png"/>
             <a:graphic>
               <a:graphicData uri="http://schemas.openxmlformats.org/drawingml/2006/picture">
                 <pic:pic>
                   <pic:nvPicPr>
-                    <pic:cNvPr id="0" name="image22.png"/>
+                    <pic:cNvPr id="0" name="image19.png"/>
                     <pic:cNvPicPr preferRelativeResize="0"/>
                   </pic:nvPicPr>
                   <pic:blipFill>
@@ -7763,12 +7827,12 @@
           <wp:inline distB="0" distT="0" distL="0" distR="0">
             <wp:extent cx="3271082" cy="3929841"/>
             <wp:effectExtent b="0" l="0" r="0" t="0"/>
-            <wp:docPr id="2095254955" name="image27.png"/>
+            <wp:docPr id="2095254955" name="image21.png"/>
             <a:graphic>
               <a:graphicData uri="http://schemas.openxmlformats.org/drawingml/2006/picture">
                 <pic:pic>
                   <pic:nvPicPr>
-                    <pic:cNvPr id="0" name="image27.png"/>
+                    <pic:cNvPr id="0" name="image21.png"/>
                     <pic:cNvPicPr preferRelativeResize="0"/>
                   </pic:nvPicPr>
                   <pic:blipFill>
@@ -7909,12 +7973,12 @@
           <wp:inline distB="0" distT="0" distL="0" distR="0">
             <wp:extent cx="3307897" cy="2836804"/>
             <wp:effectExtent b="0" l="0" r="0" t="0"/>
-            <wp:docPr id="2095254956" name="image26.png"/>
+            <wp:docPr id="2095254956" name="image22.png"/>
             <a:graphic>
               <a:graphicData uri="http://schemas.openxmlformats.org/drawingml/2006/picture">
                 <pic:pic>
                   <pic:nvPicPr>
-                    <pic:cNvPr id="0" name="image26.png"/>
+                    <pic:cNvPr id="0" name="image22.png"/>
                     <pic:cNvPicPr preferRelativeResize="0"/>
                   </pic:nvPicPr>
                   <pic:blipFill>
@@ -8068,12 +8132,12 @@
           <wp:inline distB="0" distT="0" distL="0" distR="0">
             <wp:extent cx="3343508" cy="3343508"/>
             <wp:effectExtent b="0" l="0" r="0" t="0"/>
-            <wp:docPr id="2095254927" name="image2.png"/>
+            <wp:docPr id="2095254927" name="image1.png"/>
             <a:graphic>
               <a:graphicData uri="http://schemas.openxmlformats.org/drawingml/2006/picture">
                 <pic:pic>
                   <pic:nvPicPr>
-                    <pic:cNvPr id="0" name="image2.png"/>
+                    <pic:cNvPr id="0" name="image1.png"/>
                     <pic:cNvPicPr preferRelativeResize="0"/>
                   </pic:nvPicPr>
                   <pic:blipFill>
@@ -8227,12 +8291,12 @@
           <wp:inline distB="0" distT="0" distL="0" distR="0">
             <wp:extent cx="3311265" cy="3449234"/>
             <wp:effectExtent b="0" l="0" r="0" t="0"/>
-            <wp:docPr id="2095254928" name="image7.png"/>
+            <wp:docPr id="2095254928" name="image5.png"/>
             <a:graphic>
               <a:graphicData uri="http://schemas.openxmlformats.org/drawingml/2006/picture">
                 <pic:pic>
                   <pic:nvPicPr>
-                    <pic:cNvPr id="0" name="image7.png"/>
+                    <pic:cNvPr id="0" name="image5.png"/>
                     <pic:cNvPicPr preferRelativeResize="0"/>
                   </pic:nvPicPr>
                   <pic:blipFill>
@@ -8387,12 +8451,12 @@
           <wp:inline distB="0" distT="0" distL="0" distR="0">
             <wp:extent cx="3497438" cy="3663344"/>
             <wp:effectExtent b="0" l="0" r="0" t="0"/>
-            <wp:docPr id="2095254929" name="image1.png"/>
+            <wp:docPr id="2095254929" name="image3.png"/>
             <a:graphic>
               <a:graphicData uri="http://schemas.openxmlformats.org/drawingml/2006/picture">
                 <pic:pic>
                   <pic:nvPicPr>
-                    <pic:cNvPr id="0" name="image1.png"/>
+                    <pic:cNvPr id="0" name="image3.png"/>
                     <pic:cNvPicPr preferRelativeResize="0"/>
                   </pic:nvPicPr>
                   <pic:blipFill>
@@ -8541,12 +8605,12 @@
           <wp:inline distB="0" distT="0" distL="0" distR="0">
             <wp:extent cx="3526638" cy="3092588"/>
             <wp:effectExtent b="0" l="0" r="0" t="0"/>
-            <wp:docPr id="2095254930" name="image6.png"/>
+            <wp:docPr id="2095254930" name="image7.png"/>
             <a:graphic>
               <a:graphicData uri="http://schemas.openxmlformats.org/drawingml/2006/picture">
                 <pic:pic>
                   <pic:nvPicPr>
-                    <pic:cNvPr id="0" name="image6.png"/>
+                    <pic:cNvPr id="0" name="image7.png"/>
                     <pic:cNvPicPr preferRelativeResize="0"/>
                   </pic:nvPicPr>
                   <pic:blipFill>
@@ -8734,12 +8798,12 @@
           <wp:inline distB="0" distT="0" distL="0" distR="0">
             <wp:extent cx="4536203" cy="6103055"/>
             <wp:effectExtent b="0" l="0" r="0" t="0"/>
-            <wp:docPr id="2095254931" name="image10.png"/>
+            <wp:docPr id="2095254931" name="image13.png"/>
             <a:graphic>
               <a:graphicData uri="http://schemas.openxmlformats.org/drawingml/2006/picture">
                 <pic:pic>
                   <pic:nvPicPr>
-                    <pic:cNvPr id="0" name="image10.png"/>
+                    <pic:cNvPr id="0" name="image13.png"/>
                     <pic:cNvPicPr preferRelativeResize="0"/>
                   </pic:nvPicPr>
                   <pic:blipFill>
@@ -9130,12 +9194,12 @@
           <wp:inline distB="0" distT="0" distL="0" distR="0">
             <wp:extent cx="4644060" cy="6657857"/>
             <wp:effectExtent b="0" l="0" r="0" t="0"/>
-            <wp:docPr id="2095254933" name="image15.png"/>
+            <wp:docPr id="2095254933" name="image2.png"/>
             <a:graphic>
               <a:graphicData uri="http://schemas.openxmlformats.org/drawingml/2006/picture">
                 <pic:pic>
                   <pic:nvPicPr>
-                    <pic:cNvPr id="0" name="image15.png"/>
+                    <pic:cNvPr id="0" name="image2.png"/>
                     <pic:cNvPicPr preferRelativeResize="0"/>
                   </pic:nvPicPr>
                   <pic:blipFill>
@@ -9361,12 +9425,12 @@
           <wp:inline distB="0" distT="0" distL="0" distR="0">
             <wp:extent cx="3771428" cy="5736148"/>
             <wp:effectExtent b="0" l="0" r="0" t="0"/>
-            <wp:docPr id="2095254934" name="image14.png"/>
+            <wp:docPr id="2095254934" name="image28.png"/>
             <a:graphic>
               <a:graphicData uri="http://schemas.openxmlformats.org/drawingml/2006/picture">
                 <pic:pic>
                   <pic:nvPicPr>
-                    <pic:cNvPr id="0" name="image14.png"/>
+                    <pic:cNvPr id="0" name="image28.png"/>
                     <pic:cNvPicPr preferRelativeResize="0"/>
                   </pic:nvPicPr>
                   <pic:blipFill>
@@ -9631,12 +9695,12 @@
           <wp:inline distB="0" distT="0" distL="0" distR="0">
             <wp:extent cx="2417393" cy="2457939"/>
             <wp:effectExtent b="0" l="0" r="0" t="0"/>
-            <wp:docPr id="2095254935" name="image5.png"/>
+            <wp:docPr id="2095254935" name="image10.png"/>
             <a:graphic>
               <a:graphicData uri="http://schemas.openxmlformats.org/drawingml/2006/picture">
                 <pic:pic>
                   <pic:nvPicPr>
-                    <pic:cNvPr id="0" name="image5.png"/>
+                    <pic:cNvPr id="0" name="image10.png"/>
                     <pic:cNvPicPr preferRelativeResize="0"/>
                   </pic:nvPicPr>
                   <pic:blipFill>
@@ -10000,12 +10064,12 @@
           <wp:inline distB="0" distT="0" distL="0" distR="0">
             <wp:extent cx="4169462" cy="6597433"/>
             <wp:effectExtent b="0" l="0" r="0" t="0"/>
-            <wp:docPr id="2095254926" name="image12.png"/>
+            <wp:docPr id="2095254926" name="image11.png"/>
             <a:graphic>
               <a:graphicData uri="http://schemas.openxmlformats.org/drawingml/2006/picture">
                 <pic:pic>
                   <pic:nvPicPr>
-                    <pic:cNvPr id="0" name="image12.png"/>
+                    <pic:cNvPr id="0" name="image11.png"/>
                     <pic:cNvPicPr preferRelativeResize="0"/>
                   </pic:nvPicPr>
                   <pic:blipFill>
@@ -10185,7 +10249,7 @@
     </w:p>
     <w:sdt>
       <w:sdtPr>
-        <w:id w:val="1805696693"/>
+        <w:id w:val="1530214921"/>
         <w:docPartObj>
           <w:docPartGallery w:val="Table of Contents"/>
           <w:docPartUnique w:val="1"/>

</xml_diff>